<commit_message>
Adiciona anotação sobre o capítulo 3 do livro
</commit_message>
<xml_diff>
--- a/SPRINT 3/Documentação/BUILD A LARGE LANGUAGE MODEL_Capítulo_3.docx
+++ b/SPRINT 3/Documentação/BUILD A LARGE LANGUAGE MODEL_Capítulo_3.docx
@@ -308,6 +308,330 @@
           <w:rtl w:val="0"/>
         </w:rPr>
         <w:t xml:space="preserve">Self-attention é um mecanismo que permite cada posição da sequência de entrada considerar a relevância de todas as outras posições na mesma sequência e isso é a chave das LLMs atuais baseadas na arquitetura transformer.</w:t>
+      </w:r>
+    </w:p>
+    <w:p>
+      <w:pPr>
+        <w:numPr>
+          <w:ilvl w:val="0"/>
+          <w:numId w:val="1"/>
+        </w:numPr>
+        <w:spacing w:line="360" w:lineRule="auto"/>
+        <w:ind w:left="720" w:hanging="360"/>
+        <w:jc w:val="both"/>
+        <w:rPr>
+          <w:rFonts w:ascii="Times New Roman" w:cs="Times New Roman" w:eastAsia="Times New Roman" w:hAnsi="Times New Roman"/>
+          <w:u w:val="none"/>
+        </w:rPr>
+      </w:pPr>
+      <w:r>
+        <w:rPr>
+          <w:rFonts w:ascii="Times New Roman" w:cs="Times New Roman" w:eastAsia="Times New Roman" w:hAnsi="Times New Roman"/>
+          <w:rtl w:val="0"/>
+        </w:rPr>
+        <w:t xml:space="preserve">O que é atenção: “O cachorro correu porque ele estava com sono”, quando o modelo lê “ele” o mesmo precisa descobrir a quem se refere, então ele olha para outras palavras da mesma frase e verifica quais têm relação com “ele” (peso maior). Isso é </w:t>
+      </w:r>
+      <w:r>
+        <w:rPr>
+          <w:rFonts w:ascii="Times New Roman" w:cs="Times New Roman" w:eastAsia="Times New Roman" w:hAnsi="Times New Roman"/>
+          <w:rtl w:val="0"/>
+        </w:rPr>
+        <w:t xml:space="preserve">attention</w:t>
+      </w:r>
+      <w:r>
+        <w:rPr>
+          <w:rFonts w:ascii="Times New Roman" w:cs="Times New Roman" w:eastAsia="Times New Roman" w:hAnsi="Times New Roman"/>
+          <w:rtl w:val="0"/>
+        </w:rPr>
+        <w:t xml:space="preserve">, calcular quanto cada palavra deve prestar atenção às outras.</w:t>
+      </w:r>
+    </w:p>
+    <w:p>
+      <w:pPr>
+        <w:numPr>
+          <w:ilvl w:val="0"/>
+          <w:numId w:val="1"/>
+        </w:numPr>
+        <w:spacing w:line="360" w:lineRule="auto"/>
+        <w:ind w:left="720" w:hanging="360"/>
+        <w:jc w:val="both"/>
+        <w:rPr>
+          <w:rFonts w:ascii="Times New Roman" w:cs="Times New Roman" w:eastAsia="Times New Roman" w:hAnsi="Times New Roman"/>
+          <w:u w:val="none"/>
+        </w:rPr>
+      </w:pPr>
+      <w:r>
+        <w:rPr>
+          <w:rFonts w:ascii="Times New Roman" w:cs="Times New Roman" w:eastAsia="Times New Roman" w:hAnsi="Times New Roman"/>
+          <w:rtl w:val="0"/>
+        </w:rPr>
+        <w:t xml:space="preserve">Self-attention: A atenção acontece dentro da própria sequência de entrada, a sequência olha para ela mesma, a posição 5 (ele) pode prestar atenção na posição 2 (cachorro). Ele calcula as relações entre as diferentes partes da mesma entrada.</w:t>
+      </w:r>
+    </w:p>
+    <w:p>
+      <w:pPr>
+        <w:numPr>
+          <w:ilvl w:val="0"/>
+          <w:numId w:val="1"/>
+        </w:numPr>
+        <w:spacing w:line="360" w:lineRule="auto"/>
+        <w:ind w:left="720" w:hanging="360"/>
+        <w:jc w:val="both"/>
+        <w:rPr>
+          <w:rFonts w:ascii="Times New Roman" w:cs="Times New Roman" w:eastAsia="Times New Roman" w:hAnsi="Times New Roman"/>
+          <w:u w:val="none"/>
+        </w:rPr>
+      </w:pPr>
+      <w:r>
+        <w:rPr>
+          <w:rFonts w:ascii="Times New Roman" w:cs="Times New Roman" w:eastAsia="Times New Roman" w:hAnsi="Times New Roman"/>
+          <w:rtl w:val="0"/>
+        </w:rPr>
+        <w:t xml:space="preserve">A diferença para a atenção tradicional é que ela relaciona elementos da sequência de entrada com a de saída e não com ela mesma.</w:t>
+      </w:r>
+    </w:p>
+    <w:p>
+      <w:pPr>
+        <w:numPr>
+          <w:ilvl w:val="0"/>
+          <w:numId w:val="1"/>
+        </w:numPr>
+        <w:spacing w:line="360" w:lineRule="auto"/>
+        <w:ind w:left="720" w:hanging="360"/>
+        <w:jc w:val="both"/>
+        <w:rPr>
+          <w:rFonts w:ascii="Times New Roman" w:cs="Times New Roman" w:eastAsia="Times New Roman" w:hAnsi="Times New Roman"/>
+          <w:u w:val="none"/>
+        </w:rPr>
+      </w:pPr>
+      <w:r>
+        <w:rPr>
+          <w:rFonts w:ascii="Times New Roman" w:cs="Times New Roman" w:eastAsia="Times New Roman" w:hAnsi="Times New Roman"/>
+          <w:rtl w:val="0"/>
+        </w:rPr>
+        <w:t xml:space="preserve">Por que uma palavra vira vários números: computador não consegue trabalhar diretamente com a palavra “eu”, então ela vira embeddings [0.21, -0.73, 0.45, 0.12, ...] , os números individualmente não tem um significado humano simples e a rede neural aprendeu esses números durante treinamento, no começo os vetores são inicializados com valores sem significado útil, durante o treinamento a rede vai ajustando esses números, pode-se pensar como cada valor sendo uma característica daquela palavra para melhor contextualização por parte do computador.</w:t>
+      </w:r>
+    </w:p>
+    <w:p>
+      <w:pPr>
+        <w:numPr>
+          <w:ilvl w:val="0"/>
+          <w:numId w:val="1"/>
+        </w:numPr>
+        <w:spacing w:line="360" w:lineRule="auto"/>
+        <w:ind w:left="720" w:hanging="360"/>
+        <w:jc w:val="both"/>
+        <w:rPr>
+          <w:rFonts w:ascii="Times New Roman" w:cs="Times New Roman" w:eastAsia="Times New Roman" w:hAnsi="Times New Roman"/>
+          <w:u w:val="none"/>
+        </w:rPr>
+      </w:pPr>
+      <w:r>
+        <w:rPr>
+          <w:rFonts w:ascii="Times New Roman" w:cs="Times New Roman" w:eastAsia="Times New Roman" w:hAnsi="Times New Roman"/>
+          <w:rtl w:val="0"/>
+        </w:rPr>
+        <w:t xml:space="preserve">Depois que transformado cada palavra em embeddings temos cada palavra como x(N) = [ … … … … …]. A self-attention </w:t>
+      </w:r>
+      <w:r>
+        <w:rPr>
+          <w:rFonts w:ascii="Times New Roman" w:cs="Times New Roman" w:eastAsia="Times New Roman" w:hAnsi="Times New Roman"/>
+          <w:rtl w:val="0"/>
+        </w:rPr>
+        <w:t xml:space="preserve">pega</w:t>
+      </w:r>
+      <w:r>
+        <w:rPr>
+          <w:rFonts w:ascii="Times New Roman" w:cs="Times New Roman" w:eastAsia="Times New Roman" w:hAnsi="Times New Roman"/>
+          <w:rtl w:val="0"/>
+        </w:rPr>
+        <w:t xml:space="preserve"> cada palavra e cria uma nova representação dela levando em consideração as outras palavras da frase. O modelo quer entender como tal palavra se relaciona com as outras palavras. Então ele pega a posição de uma palavra (z(N)) e vai perguntar o quanto deve-se considerar (peso de atenção) das outras palavras. α₂₁ indica o peso da posição 1 quando esta calculando o contexto da posição 2.</w:t>
+      </w:r>
+    </w:p>
+    <w:p>
+      <w:pPr>
+        <w:numPr>
+          <w:ilvl w:val="0"/>
+          <w:numId w:val="1"/>
+        </w:numPr>
+        <w:spacing w:line="360" w:lineRule="auto"/>
+        <w:ind w:left="720" w:hanging="360"/>
+        <w:jc w:val="both"/>
+        <w:rPr>
+          <w:rFonts w:ascii="Times New Roman" w:cs="Times New Roman" w:eastAsia="Times New Roman" w:hAnsi="Times New Roman"/>
+          <w:u w:val="none"/>
+        </w:rPr>
+      </w:pPr>
+      <w:r>
+        <w:rPr>
+          <w:rFonts w:ascii="Times New Roman" w:cs="Times New Roman" w:eastAsia="Times New Roman" w:hAnsi="Times New Roman"/>
+          <w:rtl w:val="0"/>
+        </w:rPr>
+        <w:t xml:space="preserve">Em self-attention o objetivo é calcular os vetores de contexto para cada elemento na sequência de entrada.</w:t>
+      </w:r>
+    </w:p>
+    <w:p>
+      <w:pPr>
+        <w:numPr>
+          <w:ilvl w:val="0"/>
+          <w:numId w:val="1"/>
+        </w:numPr>
+        <w:spacing w:line="360" w:lineRule="auto"/>
+        <w:ind w:left="720" w:hanging="360"/>
+        <w:jc w:val="both"/>
+        <w:rPr>
+          <w:rFonts w:ascii="Times New Roman" w:cs="Times New Roman" w:eastAsia="Times New Roman" w:hAnsi="Times New Roman"/>
+          <w:u w:val="none"/>
+        </w:rPr>
+      </w:pPr>
+      <w:r>
+        <w:rPr>
+          <w:rFonts w:ascii="Times New Roman" w:cs="Times New Roman" w:eastAsia="Times New Roman" w:hAnsi="Times New Roman"/>
+          <w:rtl w:val="0"/>
+        </w:rPr>
+        <w:t xml:space="preserve">Context vector: um enriquecido vetor embedding. Contém informações sobre a posição X e todos os outros elementos de entrada. Cria enriquecidas representações de cada elemento em uma sequência de entrada ao incorporar informações de todos os outros elementos da sequência. Essencial para LLMs entenderem a relação e relevância das palavras na frase entre si.</w:t>
+      </w:r>
+    </w:p>
+    <w:p>
+      <w:pPr>
+        <w:spacing w:line="360" w:lineRule="auto"/>
+        <w:ind w:left="720" w:firstLine="0"/>
+        <w:jc w:val="both"/>
+        <w:rPr>
+          <w:rFonts w:ascii="Times New Roman" w:cs="Times New Roman" w:eastAsia="Times New Roman" w:hAnsi="Times New Roman"/>
+        </w:rPr>
+      </w:pPr>
+      <w:r>
+        <w:rPr>
+          <w:rtl w:val="0"/>
+        </w:rPr>
+      </w:r>
+    </w:p>
+    <w:p>
+      <w:pPr>
+        <w:numPr>
+          <w:ilvl w:val="0"/>
+          <w:numId w:val="1"/>
+        </w:numPr>
+        <w:spacing w:line="360" w:lineRule="auto"/>
+        <w:ind w:left="720" w:hanging="360"/>
+        <w:jc w:val="both"/>
+        <w:rPr>
+          <w:rFonts w:ascii="Times New Roman" w:cs="Times New Roman" w:eastAsia="Times New Roman" w:hAnsi="Times New Roman"/>
+          <w:b w:val="1"/>
+          <w:bCs w:val="1"/>
+        </w:rPr>
+      </w:pPr>
+      <w:r>
+        <w:rPr>
+          <w:rFonts w:ascii="Times New Roman" w:cs="Times New Roman" w:eastAsia="Times New Roman" w:hAnsi="Times New Roman"/>
+          <w:b w:val="1"/>
+          <w:bCs w:val="1"/>
+          <w:rtl w:val="0"/>
+        </w:rPr>
+        <w:t xml:space="preserve">Self-attention</w:t>
+      </w:r>
+    </w:p>
+    <w:p>
+      <w:pPr>
+        <w:numPr>
+          <w:ilvl w:val="0"/>
+          <w:numId w:val="1"/>
+        </w:numPr>
+        <w:spacing w:line="360" w:lineRule="auto"/>
+        <w:ind w:left="720" w:hanging="360"/>
+        <w:jc w:val="both"/>
+        <w:rPr>
+          <w:rFonts w:ascii="Times New Roman" w:cs="Times New Roman" w:eastAsia="Times New Roman" w:hAnsi="Times New Roman"/>
+          <w:u w:val="none"/>
+        </w:rPr>
+      </w:pPr>
+      <w:r>
+        <w:rPr>
+          <w:rFonts w:ascii="Times New Roman" w:cs="Times New Roman" w:eastAsia="Times New Roman" w:hAnsi="Times New Roman"/>
+          <w:rtl w:val="0"/>
+        </w:rPr>
+        <w:t xml:space="preserve">Primeiro passo de implementação da self-attention é os attentions-scores (pontuações de atenção), em uma frase comparar uma palavra com ela mesma e as outras palavras vai gerar um número para cada e esses números são o attention scores (ω ). O computador pega os </w:t>
+      </w:r>
+      <w:r>
+        <w:rPr>
+          <w:rFonts w:ascii="Times New Roman" w:cs="Times New Roman" w:eastAsia="Times New Roman" w:hAnsi="Times New Roman"/>
+          <w:rtl w:val="0"/>
+        </w:rPr>
+        <w:t xml:space="preserve">vetores</w:t>
+      </w:r>
+      <w:r>
+        <w:rPr>
+          <w:rFonts w:ascii="Times New Roman" w:cs="Times New Roman" w:eastAsia="Times New Roman" w:hAnsi="Times New Roman"/>
+          <w:rtl w:val="0"/>
+        </w:rPr>
+        <w:t xml:space="preserve"> das duas palavras e faz uma operação matemática para compará-los. </w:t>
+      </w:r>
+    </w:p>
+    <w:p>
+      <w:pPr>
+        <w:numPr>
+          <w:ilvl w:val="0"/>
+          <w:numId w:val="1"/>
+        </w:numPr>
+        <w:spacing w:line="360" w:lineRule="auto"/>
+        <w:ind w:left="720" w:hanging="360"/>
+        <w:jc w:val="both"/>
+        <w:rPr>
+          <w:rFonts w:ascii="Times New Roman" w:cs="Times New Roman" w:eastAsia="Times New Roman" w:hAnsi="Times New Roman"/>
+          <w:u w:val="none"/>
+        </w:rPr>
+      </w:pPr>
+      <w:r>
+        <w:rPr>
+          <w:rFonts w:ascii="Times New Roman" w:cs="Times New Roman" w:eastAsia="Times New Roman" w:hAnsi="Times New Roman"/>
+          <w:rtl w:val="0"/>
+        </w:rPr>
+        <w:t xml:space="preserve">dot products: multiplicar 2 vetores (elemento com elemento) e somar seus resultados e isso nos dá 1 attention score da comparação daquela palavra com outra. Quantifica o quão perto 2 vetores estão alinhados, quanto maior o dot product maior o grau de alinhamento/similaridade entre 2 vetores.</w:t>
+      </w:r>
+    </w:p>
+    <w:p>
+      <w:pPr>
+        <w:numPr>
+          <w:ilvl w:val="0"/>
+          <w:numId w:val="1"/>
+        </w:numPr>
+        <w:spacing w:line="360" w:lineRule="auto"/>
+        <w:ind w:left="720" w:hanging="360"/>
+        <w:jc w:val="both"/>
+        <w:rPr>
+          <w:rFonts w:ascii="Times New Roman" w:cs="Times New Roman" w:eastAsia="Times New Roman" w:hAnsi="Times New Roman"/>
+          <w:u w:val="none"/>
+        </w:rPr>
+      </w:pPr>
+      <w:r>
+        <w:rPr>
+          <w:rFonts w:ascii="Times New Roman" w:cs="Times New Roman" w:eastAsia="Times New Roman" w:hAnsi="Times New Roman"/>
+          <w:rtl w:val="0"/>
+        </w:rPr>
+        <w:t xml:space="preserve">O próximo passo é normalizar cada attention score, obtendo pesos de atenção que somam até 1. Isso mantém estabilidade de treinamento na LLM.</w:t>
+      </w:r>
+    </w:p>
+    <w:p>
+      <w:pPr>
+        <w:numPr>
+          <w:ilvl w:val="0"/>
+          <w:numId w:val="1"/>
+        </w:numPr>
+        <w:spacing w:line="360" w:lineRule="auto"/>
+        <w:ind w:left="720" w:hanging="360"/>
+        <w:jc w:val="both"/>
+        <w:rPr>
+          <w:rFonts w:ascii="Times New Roman" w:cs="Times New Roman" w:eastAsia="Times New Roman" w:hAnsi="Times New Roman"/>
+          <w:u w:val="none"/>
+        </w:rPr>
+      </w:pPr>
+      <w:r>
+        <w:rPr>
+          <w:rFonts w:ascii="Times New Roman" w:cs="Times New Roman" w:eastAsia="Times New Roman" w:hAnsi="Times New Roman"/>
+          <w:rtl w:val="0"/>
+        </w:rPr>
+        <w:t xml:space="preserve">O último passo é calcular o vetor de contexto ao multiplicar os embeddings de entrada X com seus correspondentes pesos de atenção e então somar os vetores resultantes. Assim, o vetor de contexto é a soma pesada de todos os vetores de entrada, obtido ao multiplicar cada vetor de entrada por seu peso de atenção correspondente.</w:t>
       </w:r>
     </w:p>
     <w:sectPr>

</xml_diff>